<commit_message>
lesson 09 - update nội dung file Bai-Tap.docx
</commit_message>
<xml_diff>
--- a/lesson_09/Bai-Tap.docx
+++ b/lesson_09/Bai-Tap.docx
@@ -25,12 +25,6 @@
         <w:gridCol w:w="7561"/>
       </w:tblGrid>
       <w:tr>
-        <w:tblPrEx>
-          <w:tblCellMar>
-            <w:top w:w="0" w:type="dxa"/>
-            <w:bottom w:w="0" w:type="dxa"/>
-          </w:tblCellMar>
-        </w:tblPrEx>
         <w:tc>
           <w:tcPr>
             <w:tcW w:w="1799" w:type="dxa"/>
@@ -56,16 +50,7 @@
                 <w:bCs/>
                 <w:color w:val="FFFFFF"/>
               </w:rPr>
-              <w:t>Bài t</w:t>
-            </w:r>
-            <w:r>
-              <w:rPr>
-                <w:rFonts w:eastAsia="Arial"/>
-                <w:b/>
-                <w:bCs/>
-                <w:color w:val="FFFFFF"/>
-              </w:rPr>
-              <w:t>ập</w:t>
+              <w:t>Bài tập</w:t>
             </w:r>
           </w:p>
         </w:tc>
@@ -100,12 +85,6 @@
         </w:tc>
       </w:tr>
       <w:tr>
-        <w:tblPrEx>
-          <w:tblCellMar>
-            <w:top w:w="0" w:type="dxa"/>
-            <w:bottom w:w="0" w:type="dxa"/>
-          </w:tblCellMar>
-        </w:tblPrEx>
         <w:tc>
           <w:tcPr>
             <w:tcW w:w="1799" w:type="dxa"/>
@@ -156,21 +135,7 @@
                 <w:rFonts w:eastAsia="Arial"/>
                 <w:color w:val="555555"/>
               </w:rPr>
-              <w:t>crm-export-20260323.</w:t>
-            </w:r>
-            <w:r>
-              <w:rPr>
-                <w:rFonts w:eastAsia="Arial"/>
-                <w:color w:val="555555"/>
-              </w:rPr>
-              <w:t>xlsx</w:t>
-            </w:r>
-            <w:r>
-              <w:rPr>
-                <w:rFonts w:eastAsia="Arial"/>
-                <w:color w:val="555555"/>
-              </w:rPr>
-              <w:t xml:space="preserve"> — 20 deals với đầy đủ Stage, Value, Probability, Days Since Activity</w:t>
+              <w:t>crm-export-20260323.xlsx — 20 deals với đầy đủ Stage, Value, Probability, Days Since Activity</w:t>
             </w:r>
           </w:p>
           <w:p>
@@ -185,12 +150,6 @@
         </w:tc>
       </w:tr>
       <w:tr>
-        <w:tblPrEx>
-          <w:tblCellMar>
-            <w:top w:w="0" w:type="dxa"/>
-            <w:bottom w:w="0" w:type="dxa"/>
-          </w:tblCellMar>
-        </w:tblPrEx>
         <w:tc>
           <w:tcPr>
             <w:tcW w:w="1799" w:type="dxa"/>
@@ -241,21 +200,21 @@
                 <w:rFonts w:eastAsia="Arial"/>
                 <w:color w:val="555555"/>
               </w:rPr>
-              <w:t xml:space="preserve">1 </w:t>
+              <w:t xml:space="preserve">1 file </w:t>
             </w:r>
             <w:r>
               <w:rPr>
                 <w:rFonts w:eastAsia="Arial"/>
                 <w:color w:val="555555"/>
               </w:rPr>
-              <w:t xml:space="preserve">file Excel </w:t>
+              <w:t>docx</w:t>
             </w:r>
             <w:r>
               <w:rPr>
                 <w:rFonts w:eastAsia="Arial"/>
                 <w:color w:val="555555"/>
               </w:rPr>
-              <w:t>report: stage summary, deals cần action, at-risk</w:t>
+              <w:t xml:space="preserve"> report: stage summary, deals cần action, at-risk</w:t>
             </w:r>
           </w:p>
         </w:tc>
@@ -322,9 +281,6 @@
       <w:pPr>
         <w:pStyle w:val="NoSpacing"/>
         <w:spacing w:before="120"/>
-        <w:rPr>
-          <w:rFonts w:hint="eastAsia"/>
-        </w:rPr>
       </w:pPr>
       <w:r>
         <w:rPr>
@@ -447,13 +403,7 @@
         <w:spacing w:before="120"/>
       </w:pPr>
       <w:r>
-        <w:t xml:space="preserve">- Footer: "Nguồn: [tên file </w:t>
-      </w:r>
-      <w:r>
-        <w:t>excel</w:t>
-      </w:r>
-      <w:r>
-        <w:t>] | Tạo: [ngày tạo báo cáo]"</w:t>
+        <w:t>- Footer: "Nguồn: [tên file excel] | Tạo: [ngày tạo báo cáo]"</w:t>
       </w:r>
     </w:p>
     <w:p>
@@ -658,18 +608,7 @@
         <w:spacing w:before="120"/>
       </w:pPr>
       <w:r>
-        <w:t>3. Lưu output/pipeline-report</w:t>
-      </w:r>
-      <w:proofErr w:type="gramStart"/>
-      <w:r>
-        <w:t>-[</w:t>
-      </w:r>
-      <w:proofErr w:type="gramEnd"/>
-      <w:r>
-        <w:t>ngày hôm nay].</w:t>
-      </w:r>
-      <w:r>
-        <w:t>docx</w:t>
+        <w:t>3. Lưu output/pipeline-report-[ngày hôm nay].docx</w:t>
       </w:r>
     </w:p>
     <w:sectPr>

</xml_diff>